<commit_message>
docs: generate and embed high-resolution scientific plots into WeChat DOCX document
</commit_message>
<xml_diff>
--- a/PlotBase_MCP_微信公众号文章.docx
+++ b/PlotBase_MCP_微信公众号文章.docx
@@ -198,12 +198,67 @@
           <w:color w:val="1A365D"/>
           <w:sz w:val="30"/>
         </w:rPr>
-        <w:t>二、解密 PlotBase-MCP 的 5 维图表制作档案</w:t>
+        <w:t>二、解密 PlotBase-MCP 的 5 维图表制作档案与架构</w:t>
       </w:r>
     </w:p>
     <w:p>
       <w:r>
         <w:t>PlotBase MCP 数据库将科研图表抽象为包含 5 个核心维度的结构化档案：</w:t>
+      </w:r>
+    </w:p>
+    <w:p>
+      <w:pPr>
+        <w:spacing w:before="160" w:after="80"/>
+        <w:jc w:val="center"/>
+      </w:pPr>
+      <w:r>
+        <w:drawing>
+          <wp:inline xmlns:a="http://schemas.openxmlformats.org/drawingml/2006/main" xmlns:pic="http://schemas.openxmlformats.org/drawingml/2006/picture">
+            <wp:extent cx="5486400" cy="2715491"/>
+            <wp:docPr id="1" name="Picture 1"/>
+            <wp:cNvGraphicFramePr>
+              <a:graphicFrameLocks noChangeAspect="1"/>
+            </wp:cNvGraphicFramePr>
+            <a:graphic>
+              <a:graphicData uri="http://schemas.openxmlformats.org/drawingml/2006/picture">
+                <pic:pic>
+                  <pic:nvPicPr>
+                    <pic:cNvPr id="0" name="fig1_architecture.png"/>
+                    <pic:cNvPicPr/>
+                  </pic:nvPicPr>
+                  <pic:blipFill>
+                    <a:blip r:embed="rId9"/>
+                    <a:stretch>
+                      <a:fillRect/>
+                    </a:stretch>
+                  </pic:blipFill>
+                  <pic:spPr>
+                    <a:xfrm>
+                      <a:off x="0" y="0"/>
+                      <a:ext cx="5486400" cy="2715491"/>
+                    </a:xfrm>
+                    <a:prstGeom prst="rect"/>
+                  </pic:spPr>
+                </pic:pic>
+              </a:graphicData>
+            </a:graphic>
+          </wp:inline>
+        </w:drawing>
+      </w:r>
+    </w:p>
+    <w:p>
+      <w:pPr>
+        <w:spacing w:after="280"/>
+        <w:jc w:val="center"/>
+      </w:pPr>
+      <w:r>
+        <w:rPr>
+          <w:rFonts w:ascii="宋体" w:hAnsi="宋体"/>
+          <w:i/>
+          <w:color w:val="64748B"/>
+          <w:sz w:val="19"/>
+        </w:rPr>
+        <w:t>▲ 图 1：PlotBase-MCP 架构设计与 5 维制作档案交互流程图</w:t>
       </w:r>
     </w:p>
     <w:tbl>
@@ -556,7 +611,7 @@
           <w:color w:val="1A365D"/>
           <w:sz w:val="30"/>
         </w:rPr>
-        <w:t>三、实战案例与代码示例展示</w:t>
+        <w:t>三、顶刊级科研图表渲染案例与代码展示</w:t>
       </w:r>
     </w:p>
     <w:p>
@@ -571,6 +626,61 @@
       </w:r>
       <w:r>
         <w:t>当研究包含多个平行处理组（&gt;3组）且需展现连续分布趋势时，山脊图（Ridge Plot）是表现力极佳的选择：</w:t>
+      </w:r>
+    </w:p>
+    <w:p>
+      <w:pPr>
+        <w:spacing w:before="160" w:after="80"/>
+        <w:jc w:val="center"/>
+      </w:pPr>
+      <w:r>
+        <w:drawing>
+          <wp:inline xmlns:a="http://schemas.openxmlformats.org/drawingml/2006/main" xmlns:pic="http://schemas.openxmlformats.org/drawingml/2006/picture">
+            <wp:extent cx="5029200" cy="3435559"/>
+            <wp:docPr id="2" name="Picture 2"/>
+            <wp:cNvGraphicFramePr>
+              <a:graphicFrameLocks noChangeAspect="1"/>
+            </wp:cNvGraphicFramePr>
+            <a:graphic>
+              <a:graphicData uri="http://schemas.openxmlformats.org/drawingml/2006/picture">
+                <pic:pic>
+                  <pic:nvPicPr>
+                    <pic:cNvPr id="0" name="fig2_ridge_plot.png"/>
+                    <pic:cNvPicPr/>
+                  </pic:nvPicPr>
+                  <pic:blipFill>
+                    <a:blip r:embed="rId10"/>
+                    <a:stretch>
+                      <a:fillRect/>
+                    </a:stretch>
+                  </pic:blipFill>
+                  <pic:spPr>
+                    <a:xfrm>
+                      <a:off x="0" y="0"/>
+                      <a:ext cx="5029200" cy="3435559"/>
+                    </a:xfrm>
+                    <a:prstGeom prst="rect"/>
+                  </pic:spPr>
+                </pic:pic>
+              </a:graphicData>
+            </a:graphic>
+          </wp:inline>
+        </w:drawing>
+      </w:r>
+    </w:p>
+    <w:p>
+      <w:pPr>
+        <w:spacing w:after="280"/>
+        <w:jc w:val="center"/>
+      </w:pPr>
+      <w:r>
+        <w:rPr>
+          <w:rFonts w:ascii="宋体" w:hAnsi="宋体"/>
+          <w:i/>
+          <w:color w:val="64748B"/>
+          <w:sz w:val="19"/>
+        </w:rPr>
+        <w:t>▲ 图 2：PlotBase-MCP 预置案例 —— 基于 viridis 配色与 ggridges 的多组连续分布山脊图效果</w:t>
       </w:r>
     </w:p>
     <w:tbl>
@@ -631,21 +741,13 @@
               <w:br/>
               <w:t xml:space="preserve">  scale_fill_viridis(name = "Value", option = "C") +</w:t>
               <w:br/>
-              <w:t xml:space="preserve">  labs(title = '多组连续数据分布山脊图',</w:t>
-              <w:br/>
-              <w:t xml:space="preserve">       subtitle = '基于 ggridges 与 viridis 色盘',</w:t>
+              <w:t xml:space="preserve">  labs(title = '多组连续数据分布山脊图', subtitle = '基于 ggridges 与 viridis 色盘',</w:t>
               <w:br/>
               <w:t xml:space="preserve">       x = '测定值 (Value)', y = '分组 (Group)') +</w:t>
               <w:br/>
               <w:t xml:space="preserve">  theme_ridges(font_size = 13, grid = TRUE) +</w:t>
               <w:br/>
-              <w:t xml:space="preserve">  theme(</w:t>
-              <w:br/>
-              <w:t xml:space="preserve">    legend.position = "right",</w:t>
-              <w:br/>
-              <w:t xml:space="preserve">    panel.spacing = unit(0.1, "lines")</w:t>
-              <w:br/>
-              <w:t xml:space="preserve">  )</w:t>
+              <w:t xml:space="preserve">  theme(legend.position = "right", panel.spacing = unit(0.1, "lines"))</w:t>
             </w:r>
           </w:p>
         </w:tc>
@@ -663,11 +765,66 @@
           <w:color w:val="0D9488"/>
           <w:sz w:val="24"/>
         </w:rPr>
-        <w:t>案例 2：单细胞 RNA-seq 拟时序发育热图 (monocle2 + pheatmap)</w:t>
+        <w:t>案例 2：高发表级转录组差异表达火山图 (EnhancedVolcano)</w:t>
         <w:br/>
       </w:r>
       <w:r>
-        <w:t>单细胞转录组分析中用于展现细胞发育轨迹和基因动态表达模式的顶刊热图模版：</w:t>
+        <w:t>转录组/蛋白组差异表达分析的标准可视化方案，清晰标记显著上调、下调基因及关键基因 Tag：</w:t>
+      </w:r>
+    </w:p>
+    <w:p>
+      <w:pPr>
+        <w:spacing w:before="160" w:after="80"/>
+        <w:jc w:val="center"/>
+      </w:pPr>
+      <w:r>
+        <w:drawing>
+          <wp:inline xmlns:a="http://schemas.openxmlformats.org/drawingml/2006/main" xmlns:pic="http://schemas.openxmlformats.org/drawingml/2006/picture">
+            <wp:extent cx="4754880" cy="4063470"/>
+            <wp:docPr id="3" name="Picture 3"/>
+            <wp:cNvGraphicFramePr>
+              <a:graphicFrameLocks noChangeAspect="1"/>
+            </wp:cNvGraphicFramePr>
+            <a:graphic>
+              <a:graphicData uri="http://schemas.openxmlformats.org/drawingml/2006/picture">
+                <pic:pic>
+                  <pic:nvPicPr>
+                    <pic:cNvPr id="0" name="fig3_volcano_plot.png"/>
+                    <pic:cNvPicPr/>
+                  </pic:nvPicPr>
+                  <pic:blipFill>
+                    <a:blip r:embed="rId11"/>
+                    <a:stretch>
+                      <a:fillRect/>
+                    </a:stretch>
+                  </pic:blipFill>
+                  <pic:spPr>
+                    <a:xfrm>
+                      <a:off x="0" y="0"/>
+                      <a:ext cx="4754880" cy="4063470"/>
+                    </a:xfrm>
+                    <a:prstGeom prst="rect"/>
+                  </pic:spPr>
+                </pic:pic>
+              </a:graphicData>
+            </a:graphic>
+          </wp:inline>
+        </w:drawing>
+      </w:r>
+    </w:p>
+    <w:p>
+      <w:pPr>
+        <w:spacing w:after="280"/>
+        <w:jc w:val="center"/>
+      </w:pPr>
+      <w:r>
+        <w:rPr>
+          <w:rFonts w:ascii="宋体" w:hAnsi="宋体"/>
+          <w:i/>
+          <w:color w:val="64748B"/>
+          <w:sz w:val="19"/>
+        </w:rPr>
+        <w:t>▲ 图 3：PlotBase-MCP 预置案例 —— 自动标注上/下调差异基因的发表级火山图渲染效果</w:t>
       </w:r>
     </w:p>
     <w:tbl>
@@ -708,29 +865,34 @@
                 <w:color w:val="2D3748"/>
                 <w:sz w:val="19"/>
               </w:rPr>
-              <w:t>library(monocle)</w:t>
-              <w:br/>
-              <w:t>library(pheatmap)</w:t>
+              <w:t>library(EnhancedVolcano)</w:t>
               <w:br/>
               <w:br/>
-              <w:t># 提取拟时序关键差异基因</w:t>
+              <w:t>EnhancedVolcano(res,</w:t>
               <w:br/>
-              <w:t>sig_gene_names &lt;- row.names(subset(diff_test_res, qval &lt; 0.01))</w:t>
+              <w:t xml:space="preserve">  lab = rownames(res),</w:t>
               <w:br/>
+              <w:t xml:space="preserve">  x = 'log2FoldChange',</w:t>
               <w:br/>
-              <w:t># 绘制带有拟时序 (Pseudotime) 渐变标注的演变热图</w:t>
+              <w:t xml:space="preserve">  y = 'pvalue',</w:t>
               <w:br/>
-              <w:t>plot_pseudotime_heatmap(</w:t>
+              <w:t xml:space="preserve">  pCutoff = 10e-6,</w:t>
               <w:br/>
-              <w:t xml:space="preserve">  cds[sig_gene_names,],</w:t>
+              <w:t xml:space="preserve">  FCcutoff = 1.5,</w:t>
               <w:br/>
-              <w:t xml:space="preserve">  num_clusters = 4,</w:t>
+              <w:t xml:space="preserve">  pointSize = 3.0,</w:t>
               <w:br/>
-              <w:t xml:space="preserve">  cores = 4,</w:t>
+              <w:t xml:space="preserve">  labSize = 4.0,</w:t>
               <w:br/>
-              <w:t xml:space="preserve">  show_rownames = TRUE,</w:t>
+              <w:t xml:space="preserve">  col=c('black', 'black', 'blue', 'red'),</w:t>
               <w:br/>
-              <w:t xml:space="preserve">  return_heatmap = TRUE</w:t>
+              <w:t xml:space="preserve">  colAlpha = 0.8,</w:t>
+              <w:br/>
+              <w:t xml:space="preserve">  legendPosition = 'right',</w:t>
+              <w:br/>
+              <w:t xml:space="preserve">  title = '差异基因火山图 (Volcano Plot)',</w:t>
+              <w:br/>
+              <w:t xml:space="preserve">  subtitle = 'Significant Up/Down Regulated Genes'</w:t>
               <w:br/>
               <w:t>)</w:t>
             </w:r>
@@ -750,11 +912,66 @@
           <w:color w:val="0D9488"/>
           <w:sz w:val="24"/>
         </w:rPr>
-        <w:t>案例 3：Agent 自动列名映射与代码渲染 (render_figure_template)</w:t>
+        <w:t>案例 3：多指标动态时间序列走势图 (带 95% 置信区间阴影)</w:t>
         <w:br/>
       </w:r>
       <w:r>
-        <w:t>当用户传入列名映射字典 `{'value': 'ProteinExpression', 'group': 'CellState'}` 与色盘 `magma` 时，MCP 自动生成的定制代码：</w:t>
+        <w:t>适用于动物体重、基因表达随时间变化或临床随访等连续观测数据的折线趋势呈现：</w:t>
+      </w:r>
+    </w:p>
+    <w:p>
+      <w:pPr>
+        <w:spacing w:before="160" w:after="80"/>
+        <w:jc w:val="center"/>
+      </w:pPr>
+      <w:r>
+        <w:drawing>
+          <wp:inline xmlns:a="http://schemas.openxmlformats.org/drawingml/2006/main" xmlns:pic="http://schemas.openxmlformats.org/drawingml/2006/picture">
+            <wp:extent cx="5029200" cy="3104761"/>
+            <wp:docPr id="4" name="Picture 4"/>
+            <wp:cNvGraphicFramePr>
+              <a:graphicFrameLocks noChangeAspect="1"/>
+            </wp:cNvGraphicFramePr>
+            <a:graphic>
+              <a:graphicData uri="http://schemas.openxmlformats.org/drawingml/2006/picture">
+                <pic:pic>
+                  <pic:nvPicPr>
+                    <pic:cNvPr id="0" name="fig4_line_ci_plot.png"/>
+                    <pic:cNvPicPr/>
+                  </pic:nvPicPr>
+                  <pic:blipFill>
+                    <a:blip r:embed="rId12"/>
+                    <a:stretch>
+                      <a:fillRect/>
+                    </a:stretch>
+                  </pic:blipFill>
+                  <pic:spPr>
+                    <a:xfrm>
+                      <a:off x="0" y="0"/>
+                      <a:ext cx="5029200" cy="3104761"/>
+                    </a:xfrm>
+                    <a:prstGeom prst="rect"/>
+                  </pic:spPr>
+                </pic:pic>
+              </a:graphicData>
+            </a:graphic>
+          </wp:inline>
+        </w:drawing>
+      </w:r>
+    </w:p>
+    <w:p>
+      <w:pPr>
+        <w:spacing w:after="280"/>
+        <w:jc w:val="center"/>
+      </w:pPr>
+      <w:r>
+        <w:rPr>
+          <w:rFonts w:ascii="宋体" w:hAnsi="宋体"/>
+          <w:i/>
+          <w:color w:val="64748B"/>
+          <w:sz w:val="19"/>
+        </w:rPr>
+        <w:t>▲ 图 4：PlotBase-MCP 预置案例 —— Python (Seaborn) 带 95% 置信区间阴影的多组时间序列折线图</w:t>
       </w:r>
     </w:p>
     <w:tbl>
@@ -795,17 +1012,35 @@
                 <w:color w:val="2D3748"/>
                 <w:sz w:val="19"/>
               </w:rPr>
-              <w:t># [MCP 自动定制渲染输出]</w:t>
+              <w:t>import matplotlib.pyplot as plt</w:t>
               <w:br/>
-              <w:t>ggplot(df, aes(x = ProteinExpression, y = CellState, fill = ..x..)) +</w:t>
+              <w:t>import seaborn as sns</w:t>
               <w:br/>
-              <w:t xml:space="preserve">  geom_density_ridges_gradient(scale = 3, rel_min_height = 0.01) +</w:t>
               <w:br/>
-              <w:t xml:space="preserve">  scale_fill_viridis(name = "Value", option = "magma") +</w:t>
+              <w:t>sns.set_theme(style="whitegrid")</w:t>
               <w:br/>
-              <w:t xml:space="preserve">  labs(title = '单细胞蛋白表达量山脊图', x = 'ProteinExpression', y = 'CellState') +</w:t>
+              <w:t>plt.figure(figsize=(8, 5), dpi=300)</w:t>
               <w:br/>
-              <w:t xml:space="preserve">  theme_ridges(font_size = 13, grid = TRUE)</w:t>
+              <w:br/>
+              <w:t>ax = sns.lineplot(</w:t>
+              <w:br/>
+              <w:t xml:space="preserve">    data=df, x="date", y="value", hue="category",</w:t>
+              <w:br/>
+              <w:t xml:space="preserve">    style="category", markers=True, dashes=False,</w:t>
+              <w:br/>
+              <w:t xml:space="preserve">    errorbar=("ci", 95), linewidth=2.5</w:t>
+              <w:br/>
+              <w:t>)</w:t>
+              <w:br/>
+              <w:t>plt.title("多指标时间序列动态走势", fontsize=14, fontweight='bold', pad=15)</w:t>
+              <w:br/>
+              <w:t>plt.xlabel("时间 (Time)", fontsize=12)</w:t>
+              <w:br/>
+              <w:t>plt.ylabel("测量指标 (Metric)", fontsize=12)</w:t>
+              <w:br/>
+              <w:t>plt.legend(title="类别", frameon=True)</w:t>
+              <w:br/>
+              <w:t>plt.tight_layout()</w:t>
             </w:r>
           </w:p>
         </w:tc>

</xml_diff>

<commit_message>
docs: add contribution notice for example archives
</commit_message>
<xml_diff>
--- a/PlotBase_MCP_微信公众号文章.docx
+++ b/PlotBase_MCP_微信公众号文章.docx
@@ -34,7 +34,7 @@
     </w:p>
     <w:p>
       <w:pPr>
-        <w:spacing w:after="480"/>
+        <w:spacing w:after="360"/>
         <w:jc w:val="center"/>
       </w:pPr>
       <w:r>
@@ -45,6 +45,67 @@
         </w:rPr>
         <w:t>作者：Antigravity AI Team | GitHub 开源项目 | 阅读时间：约 8 分钟</w:t>
       </w:r>
+    </w:p>
+    <w:tbl>
+      <w:tblPr>
+        <w:tblW w:type="auto" w:w="0"/>
+        <w:jc w:val="center"/>
+        <w:tblLayout w:type="fixed"/>
+        <w:tblLook w:firstColumn="1" w:firstRow="1" w:lastColumn="0" w:lastRow="0" w:noHBand="0" w:noVBand="1" w:val="04A0"/>
+      </w:tblPr>
+      <w:tblGrid>
+        <w:gridCol w:w="9360"/>
+      </w:tblGrid>
+      <w:tr>
+        <w:tc>
+          <w:tcPr>
+            <w:tcW w:type="dxa" w:w="9360"/>
+            <w:shd w:fill="FFFBEB"/>
+            <w:tcMar>
+              <w:top w:w="140" w:type="dxa"/>
+              <w:bottom w:w="140" w:type="dxa"/>
+              <w:left w:w="200" w:type="dxa"/>
+              <w:right w:w="200" w:type="dxa"/>
+            </w:tcMar>
+            <w:tcBorders>
+              <w:left w:val="single" w:sz="24" w:space="0" w:color="D97706"/>
+              <w:top w:val="none"/>
+              <w:right w:val="none"/>
+              <w:bottom w:val="none"/>
+            </w:tcBorders>
+          </w:tcPr>
+          <w:p>
+            <w:pPr>
+              <w:spacing w:before="40" w:after="80"/>
+            </w:pPr>
+            <w:r>
+              <w:rPr>
+                <w:rFonts w:ascii="Arial" w:hAnsi="Arial"/>
+                <w:b/>
+                <w:color w:val="B45309"/>
+                <w:sz w:val="22"/>
+              </w:rPr>
+              <w:t>💡 补充说明 &amp; 示例征集 (Call for Examples)</w:t>
+              <w:br/>
+            </w:r>
+            <w:r>
+              <w:rPr>
+                <w:rFonts w:ascii="宋体" w:hAnsi="宋体"/>
+                <w:color w:val="334155"/>
+                <w:sz w:val="20"/>
+              </w:rPr>
+              <w:t>📢 PlotBase 的图表制作档案库目前仍处于【持续完善与扩充中】！</w:t>
+              <w:br/>
+              <w:t>我们极其欢迎广大科研人员、数据分析师与开源爱好者共同建设。如果你手头有高质量的 R/Python 绘图代码、顶刊配色模版或特定图表的 Agent 微调经验，非常欢迎提交示例与建议！</w:t>
+            </w:r>
+          </w:p>
+        </w:tc>
+      </w:tr>
+    </w:tbl>
+    <w:p>
+      <w:pPr>
+        <w:spacing w:after="120"/>
+      </w:pPr>
     </w:p>
     <w:p>
       <w:pPr>
@@ -1223,7 +1284,7 @@
           <w:color w:val="1A365D"/>
           <w:sz w:val="30"/>
         </w:rPr>
-        <w:t>五、总结与开源致谢</w:t>
+        <w:t>五、总结与示例征集致谢</w:t>
       </w:r>
     </w:p>
     <w:p>
@@ -1248,7 +1309,7 @@
         <w:tc>
           <w:tcPr>
             <w:tcW w:type="dxa" w:w="9360"/>
-            <w:shd w:fill="F0F9FF"/>
+            <w:shd w:fill="F0FDF4"/>
             <w:tcMar>
               <w:top w:w="140" w:type="dxa"/>
               <w:bottom w:w="140" w:type="dxa"/>
@@ -1256,7 +1317,7 @@
               <w:right w:w="200" w:type="dxa"/>
             </w:tcMar>
             <w:tcBorders>
-              <w:left w:val="single" w:sz="24" w:space="0" w:color="0284C7"/>
+              <w:left w:val="single" w:sz="24" w:space="0" w:color="0D9488"/>
               <w:top w:val="none"/>
               <w:right w:val="none"/>
               <w:bottom w:val="none"/>
@@ -1270,10 +1331,10 @@
               <w:rPr>
                 <w:rFonts w:ascii="Arial" w:hAnsi="Arial"/>
                 <w:b/>
-                <w:color w:val="0369A1"/>
+                <w:color w:val="0F766E"/>
                 <w:sz w:val="22"/>
               </w:rPr>
-              <w:t>💡 GitHub 开源仓库信息</w:t>
+              <w:t>💡 欢迎提交示例与共同建设</w:t>
               <w:br/>
             </w:r>
             <w:r>
@@ -1282,11 +1343,16 @@
                 <w:color w:val="334155"/>
                 <w:sz w:val="20"/>
               </w:rPr>
-              <w:t>欢迎 Star、Fork 并贡献你的专属科研图表制作档案！</w:t>
+              <w:t>目前 PlotBase 记忆库的案例还在持续完善与扩充中！欢迎广大科研作者与开发者提供高质量绘图示例：</w:t>
               <w:br/>
-              <w:t>🔗 GitHub 项目地址：https://github.com/Avatar-stack/plotbase-mcp</w:t>
+              <w:t>• 提交 PR 添加全新的 R/Python 制作档案；</w:t>
               <w:br/>
-              <w:t>许可协议：MIT License</w:t>
+              <w:t>• 提交 Issue 推荐优雅的配色规则与 Agent 调优经验。</w:t>
+              <w:br/>
+              <w:br/>
+              <w:t>🔗 GitHub 开源项目地址：https://github.com/Avatar-stack/plotbase-mcp</w:t>
+              <w:br/>
+              <w:t>开源许可：MIT License</w:t>
             </w:r>
           </w:p>
         </w:tc>

</xml_diff>